<commit_message>
docs: done: project architecture
</commit_message>
<xml_diff>
--- a/docs/04-architecture.docx
+++ b/docs/04-architecture.docx
@@ -1,6 +1,6 @@
 
 <file path=word/document.xml><?xml version="1.0" encoding="utf-8"?>
-<w:document xmlns:wpc="http://schemas.microsoft.com/office/word/2010/wordprocessingCanvas" xmlns:cx="http://schemas.microsoft.com/office/drawing/2014/chartex" xmlns:cx1="http://schemas.microsoft.com/office/drawing/2015/9/8/chartex" xmlns:cx2="http://schemas.microsoft.com/office/drawing/2015/10/21/chartex" xmlns:cx3="http://schemas.microsoft.com/office/drawing/2016/5/9/chartex" xmlns:cx4="http://schemas.microsoft.com/office/drawing/2016/5/10/chartex" xmlns:cx5="http://schemas.microsoft.com/office/drawing/2016/5/11/chartex" xmlns:cx6="http://schemas.microsoft.com/office/drawing/2016/5/12/chartex" xmlns:cx7="http://schemas.microsoft.com/office/drawing/2016/5/13/chartex" xmlns:cx8="http://schemas.microsoft.com/office/drawing/2016/5/14/chartex" xmlns:mc="http://schemas.openxmlformats.org/markup-compatibility/2006" xmlns:aink="http://schemas.microsoft.com/office/drawing/2016/ink" xmlns:am3d="http://schemas.microsoft.com/office/drawing/2017/model3d" xmlns:o="urn:schemas-microsoft-com:office:office" xmlns:oel="http://schemas.microsoft.com/office/2019/extlst" xmlns:r="http://schemas.openxmlformats.org/officeDocument/2006/relationships" xmlns:m="http://schemas.openxmlformats.org/officeDocument/2006/math" xmlns:v="urn:schemas-microsoft-com:vml" xmlns:wp14="http://schemas.microsoft.com/office/word/2010/wordprocessingDrawing" xmlns:wp="http://schemas.openxmlformats.org/drawingml/2006/wordprocessingDrawing" xmlns:w10="urn:schemas-microsoft-com:office:word" xmlns:w="http://schemas.openxmlformats.org/wordprocessingml/2006/main" xmlns:w14="http://schemas.microsoft.com/office/word/2010/wordml" xmlns:w15="http://schemas.microsoft.com/office/word/2012/wordml" xmlns:w16cex="http://schemas.microsoft.com/office/word/2018/wordml/cex" xmlns:w16cid="http://schemas.microsoft.com/office/word/2016/wordml/cid" xmlns:w16="http://schemas.microsoft.com/office/word/2018/wordml" xmlns:w16sdtdh="http://schemas.microsoft.com/office/word/2020/wordml/sdtdatahash" xmlns:w16se="http://schemas.microsoft.com/office/word/2015/wordml/symex" xmlns:wpg="http://schemas.microsoft.com/office/word/2010/wordprocessingGroup" xmlns:wpi="http://schemas.microsoft.com/office/word/2010/wordprocessingInk" xmlns:wne="http://schemas.microsoft.com/office/word/2006/wordml" xmlns:wps="http://schemas.microsoft.com/office/word/2010/wordprocessingShape" mc:Ignorable="w14 w15 w16se w16cid w16 w16cex w16sdtdh wp14">
+<w:document xmlns:wpc="http://schemas.microsoft.com/office/word/2010/wordprocessingCanvas" xmlns:cx="http://schemas.microsoft.com/office/drawing/2014/chartex" xmlns:cx1="http://schemas.microsoft.com/office/drawing/2015/9/8/chartex" xmlns:cx2="http://schemas.microsoft.com/office/drawing/2015/10/21/chartex" xmlns:cx3="http://schemas.microsoft.com/office/drawing/2016/5/9/chartex" xmlns:cx4="http://schemas.microsoft.com/office/drawing/2016/5/10/chartex" xmlns:cx5="http://schemas.microsoft.com/office/drawing/2016/5/11/chartex" xmlns:cx6="http://schemas.microsoft.com/office/drawing/2016/5/12/chartex" xmlns:cx7="http://schemas.microsoft.com/office/drawing/2016/5/13/chartex" xmlns:cx8="http://schemas.microsoft.com/office/drawing/2016/5/14/chartex" xmlns:mc="http://schemas.openxmlformats.org/markup-compatibility/2006" xmlns:aink="http://schemas.microsoft.com/office/drawing/2016/ink" xmlns:am3d="http://schemas.microsoft.com/office/drawing/2017/model3d" xmlns:o="urn:schemas-microsoft-com:office:office" xmlns:r="http://schemas.openxmlformats.org/officeDocument/2006/relationships" xmlns:m="http://schemas.openxmlformats.org/officeDocument/2006/math" xmlns:v="urn:schemas-microsoft-com:vml" xmlns:wp14="http://schemas.microsoft.com/office/word/2010/wordprocessingDrawing" xmlns:wp="http://schemas.openxmlformats.org/drawingml/2006/wordprocessingDrawing" xmlns:w10="urn:schemas-microsoft-com:office:word" xmlns:w="http://schemas.openxmlformats.org/wordprocessingml/2006/main" xmlns:w14="http://schemas.microsoft.com/office/word/2010/wordml" xmlns:w15="http://schemas.microsoft.com/office/word/2012/wordml" xmlns:w16cex="http://schemas.microsoft.com/office/word/2018/wordml/cex" xmlns:w16cid="http://schemas.microsoft.com/office/word/2016/wordml/cid" xmlns:w16="http://schemas.microsoft.com/office/word/2018/wordml" xmlns:w16sdtdh="http://schemas.microsoft.com/office/word/2020/wordml/sdtdatahash" xmlns:w16se="http://schemas.microsoft.com/office/word/2015/wordml/symex" xmlns:wpg="http://schemas.microsoft.com/office/word/2010/wordprocessingGroup" xmlns:wpi="http://schemas.microsoft.com/office/word/2010/wordprocessingInk" xmlns:wne="http://schemas.microsoft.com/office/word/2006/wordml" xmlns:wps="http://schemas.microsoft.com/office/word/2010/wordprocessingShape" mc:Ignorable="w14 w15 w16se w16cid w16 w16cex w16sdtdh wp14">
   <w:body>
     <w:p>
       <w:pPr>
@@ -225,6 +225,7 @@
         <w:rPr>
           <w:sz w:val="28"/>
           <w:szCs w:val="32"/>
+          <w:lang w:val="en-US"/>
         </w:rPr>
       </w:pPr>
       <w:r>
@@ -539,7 +540,6 @@
         <w:rPr>
           <w:sz w:val="28"/>
           <w:szCs w:val="32"/>
-          <w:lang w:val="en-US"/>
         </w:rPr>
       </w:pPr>
       <w:r>
@@ -712,31 +712,13 @@
         </w:rPr>
         <w:t xml:space="preserve"> (</w:t>
       </w:r>
-      <w:proofErr w:type="spellStart"/>
-      <w:r>
-        <w:rPr>
-          <w:sz w:val="28"/>
-          <w:szCs w:val="32"/>
-        </w:rPr>
-        <w:t>вкл</w:t>
-      </w:r>
-      <w:proofErr w:type="spellEnd"/>
-      <w:r>
-        <w:rPr>
-          <w:sz w:val="28"/>
-          <w:szCs w:val="32"/>
-        </w:rPr>
-        <w:t>/</w:t>
-      </w:r>
-      <w:proofErr w:type="spellStart"/>
-      <w:r>
-        <w:rPr>
-          <w:sz w:val="28"/>
-          <w:szCs w:val="32"/>
-        </w:rPr>
-        <w:t>выкл</w:t>
-      </w:r>
-      <w:proofErr w:type="spellEnd"/>
+      <w:r>
+        <w:rPr>
+          <w:sz w:val="28"/>
+          <w:szCs w:val="32"/>
+        </w:rPr>
+        <w:t>вкл/выкл</w:t>
+      </w:r>
       <w:r>
         <w:rPr>
           <w:sz w:val="28"/>
@@ -808,17 +790,280 @@
           <w:sz w:val="28"/>
           <w:szCs w:val="32"/>
         </w:rPr>
+        <w:t xml:space="preserve"> use cases</w:t>
+      </w:r>
+    </w:p>
+    <w:p>
+      <w:pPr>
+        <w:rPr>
+          <w:sz w:val="28"/>
+          <w:szCs w:val="32"/>
+        </w:rPr>
+      </w:pPr>
+      <w:r>
+        <w:rPr>
+          <w:sz w:val="28"/>
+          <w:szCs w:val="32"/>
+        </w:rPr>
+        <w:t>Сделать задание</w:t>
+      </w:r>
+      <w:r>
+        <w:rPr>
+          <w:sz w:val="28"/>
+          <w:szCs w:val="32"/>
+        </w:rPr>
+        <w:t xml:space="preserve"> (тема, сложность)</w:t>
+      </w:r>
+    </w:p>
+    <w:p>
+      <w:pPr>
+        <w:rPr>
+          <w:sz w:val="28"/>
+          <w:szCs w:val="32"/>
+        </w:rPr>
+      </w:pPr>
+      <w:r>
+        <w:rPr>
+          <w:sz w:val="28"/>
+          <w:szCs w:val="32"/>
+        </w:rPr>
+        <w:t>Проверить фото</w:t>
+      </w:r>
+      <w:r>
+        <w:rPr>
+          <w:sz w:val="28"/>
+          <w:szCs w:val="32"/>
+        </w:rPr>
+        <w:t xml:space="preserve"> (тема, фото)</w:t>
+      </w:r>
+    </w:p>
+    <w:p>
+      <w:pPr>
+        <w:rPr>
+          <w:sz w:val="28"/>
+          <w:szCs w:val="32"/>
+        </w:rPr>
+      </w:pPr>
+      <w:r>
+        <w:rPr>
+          <w:sz w:val="28"/>
+          <w:szCs w:val="32"/>
+        </w:rPr>
+        <w:t>Сохранить фото</w:t>
+      </w:r>
+      <w:r>
+        <w:rPr>
+          <w:sz w:val="28"/>
+          <w:szCs w:val="32"/>
+        </w:rPr>
+        <w:t xml:space="preserve"> (фото, геолокация)</w:t>
+      </w:r>
+    </w:p>
+    <w:p>
+      <w:pPr>
+        <w:rPr>
+          <w:sz w:val="28"/>
+          <w:szCs w:val="32"/>
+        </w:rPr>
+      </w:pPr>
+      <w:r>
+        <w:rPr>
+          <w:sz w:val="28"/>
+          <w:szCs w:val="32"/>
+        </w:rPr>
+        <w:t>Получить статистику</w:t>
+      </w:r>
+    </w:p>
+    <w:p>
+      <w:pPr>
+        <w:rPr>
+          <w:sz w:val="28"/>
+          <w:szCs w:val="32"/>
+        </w:rPr>
+      </w:pPr>
+      <w:r>
+        <w:rPr>
+          <w:sz w:val="28"/>
+          <w:szCs w:val="32"/>
+        </w:rPr>
+        <w:t>Получить прогресс</w:t>
+      </w:r>
+    </w:p>
+    <w:p>
+      <w:pPr>
+        <w:rPr>
+          <w:sz w:val="28"/>
+          <w:szCs w:val="32"/>
+        </w:rPr>
+      </w:pPr>
+    </w:p>
+    <w:p>
+      <w:pPr>
+        <w:rPr>
+          <w:sz w:val="28"/>
+          <w:szCs w:val="32"/>
+        </w:rPr>
+      </w:pPr>
+      <w:r>
+        <w:rPr>
+          <w:sz w:val="28"/>
+          <w:szCs w:val="32"/>
+        </w:rPr>
+        <w:t>Принципы</w:t>
+      </w:r>
+      <w:r>
+        <w:rPr>
+          <w:sz w:val="28"/>
+          <w:szCs w:val="32"/>
+        </w:rPr>
+        <w:t xml:space="preserve"> SOLID</w:t>
+      </w:r>
+      <w:r>
+        <w:rPr>
+          <w:sz w:val="28"/>
+          <w:szCs w:val="32"/>
+        </w:rPr>
+        <w:t xml:space="preserve"> в проекте</w:t>
+      </w:r>
+    </w:p>
+    <w:p>
+      <w:pPr>
+        <w:rPr>
+          <w:sz w:val="28"/>
+          <w:szCs w:val="32"/>
+        </w:rPr>
+      </w:pPr>
+      <w:r>
+        <w:rPr>
+          <w:sz w:val="28"/>
+          <w:szCs w:val="32"/>
+          <w:lang w:val="en-US"/>
+        </w:rPr>
+        <w:t>S</w:t>
+      </w:r>
+      <w:r>
+        <w:rPr>
+          <w:sz w:val="28"/>
+          <w:szCs w:val="32"/>
+        </w:rPr>
+        <w:t xml:space="preserve"> – </w:t>
+      </w:r>
+      <w:r>
+        <w:rPr>
+          <w:sz w:val="28"/>
+          <w:szCs w:val="32"/>
+        </w:rPr>
+        <w:t>Выдать задание кейс, Проверить фото кейс</w:t>
+      </w:r>
+    </w:p>
+    <w:p>
+      <w:pPr>
+        <w:rPr>
+          <w:sz w:val="28"/>
+          <w:szCs w:val="32"/>
+        </w:rPr>
+      </w:pPr>
+      <w:r>
+        <w:rPr>
+          <w:sz w:val="28"/>
+          <w:szCs w:val="32"/>
+          <w:lang w:val="en-US"/>
+        </w:rPr>
+        <w:t>O</w:t>
+      </w:r>
+      <w:r>
+        <w:rPr>
+          <w:sz w:val="28"/>
+          <w:szCs w:val="32"/>
+        </w:rPr>
+        <w:t xml:space="preserve"> – Интерфейс заданий, Интерфейс фото</w:t>
+      </w:r>
+    </w:p>
+    <w:p>
+      <w:pPr>
+        <w:rPr>
+          <w:sz w:val="28"/>
+          <w:szCs w:val="32"/>
+        </w:rPr>
+      </w:pPr>
+      <w:r>
+        <w:rPr>
+          <w:sz w:val="28"/>
+          <w:szCs w:val="32"/>
+          <w:lang w:val="en-US"/>
+        </w:rPr>
+        <w:t>L</w:t>
+      </w:r>
+      <w:r>
+        <w:rPr>
+          <w:sz w:val="28"/>
+          <w:szCs w:val="32"/>
+        </w:rPr>
+        <w:t xml:space="preserve"> – </w:t>
+      </w:r>
+      <w:r>
+        <w:rPr>
+          <w:sz w:val="28"/>
+          <w:szCs w:val="32"/>
+          <w:lang w:val="en-US"/>
+        </w:rPr>
+        <w:t>TaskRepoImpl</w:t>
+      </w:r>
+      <w:r>
+        <w:rPr>
+          <w:sz w:val="28"/>
+          <w:szCs w:val="32"/>
+        </w:rPr>
         <w:t xml:space="preserve"> </w:t>
       </w:r>
-      <w:proofErr w:type="spellStart"/>
-      <w:r>
-        <w:rPr>
-          <w:sz w:val="28"/>
-          <w:szCs w:val="32"/>
-        </w:rPr>
-        <w:t>use</w:t>
-      </w:r>
-      <w:proofErr w:type="spellEnd"/>
+      <w:r>
+        <w:rPr>
+          <w:sz w:val="28"/>
+          <w:szCs w:val="32"/>
+        </w:rPr>
+        <w:t xml:space="preserve">– </w:t>
+      </w:r>
+      <w:r>
+        <w:rPr>
+          <w:sz w:val="28"/>
+          <w:szCs w:val="32"/>
+          <w:lang w:val="en-US"/>
+        </w:rPr>
+        <w:t>FakeTaskRepo</w:t>
+      </w:r>
+    </w:p>
+    <w:p>
+      <w:pPr>
+        <w:rPr>
+          <w:sz w:val="28"/>
+          <w:szCs w:val="32"/>
+          <w:lang w:val="en-US"/>
+        </w:rPr>
+      </w:pPr>
+      <w:r>
+        <w:rPr>
+          <w:sz w:val="28"/>
+          <w:szCs w:val="32"/>
+          <w:lang w:val="en-US"/>
+        </w:rPr>
+        <w:t>I – TaskRepo, PhotoRepo, ProgressRepo</w:t>
+      </w:r>
+    </w:p>
+    <w:p>
+      <w:pPr>
+        <w:rPr>
+          <w:sz w:val="28"/>
+          <w:szCs w:val="32"/>
+        </w:rPr>
+      </w:pPr>
+      <w:r>
+        <w:rPr>
+          <w:sz w:val="28"/>
+          <w:szCs w:val="32"/>
+          <w:lang w:val="en-US"/>
+        </w:rPr>
+        <w:t>D</w:t>
+      </w:r>
       <w:r>
         <w:rPr>
           <w:sz w:val="28"/>
@@ -826,240 +1071,17 @@
         </w:rPr>
         <w:t xml:space="preserve"> </w:t>
       </w:r>
-      <w:proofErr w:type="spellStart"/>
-      <w:r>
-        <w:rPr>
-          <w:sz w:val="28"/>
-          <w:szCs w:val="32"/>
-        </w:rPr>
-        <w:t>cases</w:t>
-      </w:r>
-      <w:proofErr w:type="spellEnd"/>
-    </w:p>
-    <w:p>
-      <w:pPr>
-        <w:rPr>
-          <w:sz w:val="28"/>
-          <w:szCs w:val="32"/>
-        </w:rPr>
-      </w:pPr>
-      <w:r>
-        <w:rPr>
-          <w:sz w:val="28"/>
-          <w:szCs w:val="32"/>
-        </w:rPr>
-        <w:t>Сделать задание</w:t>
-      </w:r>
-      <w:r>
-        <w:rPr>
-          <w:sz w:val="28"/>
-          <w:szCs w:val="32"/>
-        </w:rPr>
-        <w:t xml:space="preserve"> (тема, сложность)</w:t>
-      </w:r>
-    </w:p>
-    <w:p>
-      <w:pPr>
-        <w:rPr>
-          <w:sz w:val="28"/>
-          <w:szCs w:val="32"/>
-        </w:rPr>
-      </w:pPr>
-      <w:r>
-        <w:rPr>
-          <w:sz w:val="28"/>
-          <w:szCs w:val="32"/>
-        </w:rPr>
-        <w:t>Проверить фото</w:t>
-      </w:r>
-      <w:r>
-        <w:rPr>
-          <w:sz w:val="28"/>
-          <w:szCs w:val="32"/>
-        </w:rPr>
-        <w:t xml:space="preserve"> (тема, фото)</w:t>
-      </w:r>
-    </w:p>
-    <w:p>
-      <w:pPr>
-        <w:rPr>
-          <w:sz w:val="28"/>
-          <w:szCs w:val="32"/>
-        </w:rPr>
-      </w:pPr>
-      <w:r>
-        <w:rPr>
-          <w:sz w:val="28"/>
-          <w:szCs w:val="32"/>
-        </w:rPr>
-        <w:t>Сохранить фото</w:t>
-      </w:r>
-      <w:r>
-        <w:rPr>
-          <w:sz w:val="28"/>
-          <w:szCs w:val="32"/>
-        </w:rPr>
-        <w:t xml:space="preserve"> (фото, геолокация)</w:t>
-      </w:r>
-    </w:p>
-    <w:p>
-      <w:pPr>
-        <w:rPr>
-          <w:sz w:val="28"/>
-          <w:szCs w:val="32"/>
-        </w:rPr>
-      </w:pPr>
-      <w:r>
-        <w:rPr>
-          <w:sz w:val="28"/>
-          <w:szCs w:val="32"/>
-        </w:rPr>
-        <w:t>Получить статистику</w:t>
-      </w:r>
-    </w:p>
-    <w:p>
-      <w:pPr>
-        <w:rPr>
-          <w:sz w:val="28"/>
-          <w:szCs w:val="32"/>
-        </w:rPr>
-      </w:pPr>
-      <w:r>
-        <w:rPr>
-          <w:sz w:val="28"/>
-          <w:szCs w:val="32"/>
-        </w:rPr>
-        <w:t>Получить прогресс</w:t>
-      </w:r>
-    </w:p>
-    <w:p>
-      <w:pPr>
-        <w:rPr>
-          <w:sz w:val="28"/>
-          <w:szCs w:val="32"/>
-        </w:rPr>
-      </w:pPr>
-    </w:p>
-    <w:p>
-      <w:pPr>
-        <w:rPr>
-          <w:sz w:val="28"/>
-          <w:szCs w:val="32"/>
-        </w:rPr>
-      </w:pPr>
-      <w:r>
-        <w:rPr>
-          <w:sz w:val="28"/>
-          <w:szCs w:val="32"/>
-        </w:rPr>
-        <w:t>Принципы</w:t>
-      </w:r>
-      <w:r>
-        <w:rPr>
-          <w:sz w:val="28"/>
-          <w:szCs w:val="32"/>
-        </w:rPr>
-        <w:t xml:space="preserve"> SOLID</w:t>
-      </w:r>
-      <w:r>
-        <w:rPr>
-          <w:sz w:val="28"/>
-          <w:szCs w:val="32"/>
-        </w:rPr>
-        <w:t xml:space="preserve"> в проекте</w:t>
-      </w:r>
-    </w:p>
-    <w:p>
-      <w:pPr>
-        <w:rPr>
-          <w:sz w:val="28"/>
-          <w:szCs w:val="32"/>
-        </w:rPr>
-      </w:pPr>
-      <w:r>
-        <w:rPr>
-          <w:sz w:val="28"/>
-          <w:szCs w:val="32"/>
-          <w:lang w:val="en-US"/>
-        </w:rPr>
-        <w:t>S</w:t>
-      </w:r>
-      <w:r>
-        <w:rPr>
-          <w:sz w:val="28"/>
-          <w:szCs w:val="32"/>
-        </w:rPr>
-        <w:t xml:space="preserve"> – </w:t>
-      </w:r>
-      <w:r>
-        <w:rPr>
-          <w:sz w:val="28"/>
-          <w:szCs w:val="32"/>
-        </w:rPr>
-        <w:t>Выдать задание кейс, Проверить фото кейс</w:t>
-      </w:r>
-    </w:p>
-    <w:p>
-      <w:pPr>
-        <w:rPr>
-          <w:sz w:val="28"/>
-          <w:szCs w:val="32"/>
-        </w:rPr>
-      </w:pPr>
-      <w:r>
-        <w:rPr>
-          <w:sz w:val="28"/>
-          <w:szCs w:val="32"/>
-          <w:lang w:val="en-US"/>
-        </w:rPr>
-        <w:t>O</w:t>
-      </w:r>
-      <w:r>
-        <w:rPr>
-          <w:sz w:val="28"/>
-          <w:szCs w:val="32"/>
-        </w:rPr>
-        <w:t xml:space="preserve"> – Интерфейс заданий, Интерфейс фото</w:t>
-      </w:r>
-    </w:p>
-    <w:p>
-      <w:pPr>
-        <w:rPr>
-          <w:sz w:val="28"/>
-          <w:szCs w:val="32"/>
-          <w:lang w:val="en-US"/>
-        </w:rPr>
-      </w:pPr>
-      <w:r>
-        <w:rPr>
-          <w:sz w:val="28"/>
-          <w:szCs w:val="32"/>
-          <w:lang w:val="en-US"/>
-        </w:rPr>
-        <w:t>L</w:t>
-      </w:r>
-      <w:r>
-        <w:rPr>
-          <w:sz w:val="28"/>
-          <w:szCs w:val="32"/>
-        </w:rPr>
-        <w:t xml:space="preserve"> – </w:t>
-      </w:r>
-      <w:proofErr w:type="spellStart"/>
-      <w:r>
-        <w:rPr>
-          <w:sz w:val="28"/>
-          <w:szCs w:val="32"/>
-          <w:lang w:val="en-US"/>
-        </w:rPr>
-        <w:t>TaskRepoImpl</w:t>
-      </w:r>
-      <w:proofErr w:type="spellEnd"/>
-      <w:r>
-        <w:rPr>
-          <w:sz w:val="28"/>
-          <w:szCs w:val="32"/>
-          <w:lang w:val="en-US"/>
+      <w:r>
+        <w:rPr>
+          <w:sz w:val="28"/>
+          <w:szCs w:val="32"/>
+        </w:rPr>
+        <w:t>–</w:t>
+      </w:r>
+      <w:r>
+        <w:rPr>
+          <w:sz w:val="28"/>
+          <w:szCs w:val="32"/>
         </w:rPr>
         <w:t xml:space="preserve"> </w:t>
       </w:r>
@@ -1068,124 +1090,92 @@
           <w:sz w:val="28"/>
           <w:szCs w:val="32"/>
         </w:rPr>
-        <w:t xml:space="preserve">– </w:t>
-      </w:r>
-      <w:proofErr w:type="spellStart"/>
-      <w:r>
-        <w:rPr>
-          <w:sz w:val="28"/>
-          <w:szCs w:val="32"/>
-          <w:lang w:val="en-US"/>
-        </w:rPr>
-        <w:t>FakeTaskRepo</w:t>
-      </w:r>
-      <w:proofErr w:type="spellEnd"/>
-    </w:p>
-    <w:p>
-      <w:pPr>
-        <w:rPr>
-          <w:sz w:val="28"/>
-          <w:szCs w:val="32"/>
-          <w:lang w:val="en-US"/>
-        </w:rPr>
-      </w:pPr>
-      <w:r>
-        <w:rPr>
-          <w:sz w:val="28"/>
-          <w:szCs w:val="32"/>
-          <w:lang w:val="en-US"/>
-        </w:rPr>
-        <w:t xml:space="preserve">I – </w:t>
-      </w:r>
-      <w:proofErr w:type="spellStart"/>
-      <w:r>
-        <w:rPr>
-          <w:sz w:val="28"/>
-          <w:szCs w:val="32"/>
-          <w:lang w:val="en-US"/>
-        </w:rPr>
-        <w:t>TaskRepo</w:t>
-      </w:r>
-      <w:proofErr w:type="spellEnd"/>
-      <w:r>
-        <w:rPr>
-          <w:sz w:val="28"/>
-          <w:szCs w:val="32"/>
-          <w:lang w:val="en-US"/>
-        </w:rPr>
-        <w:t xml:space="preserve">, </w:t>
-      </w:r>
-      <w:proofErr w:type="spellStart"/>
-      <w:r>
-        <w:rPr>
-          <w:sz w:val="28"/>
-          <w:szCs w:val="32"/>
-          <w:lang w:val="en-US"/>
-        </w:rPr>
-        <w:t>PhotoRepo</w:t>
-      </w:r>
-      <w:proofErr w:type="spellEnd"/>
-      <w:r>
-        <w:rPr>
-          <w:sz w:val="28"/>
-          <w:szCs w:val="32"/>
-          <w:lang w:val="en-US"/>
-        </w:rPr>
-        <w:t xml:space="preserve">, </w:t>
-      </w:r>
-      <w:proofErr w:type="spellStart"/>
-      <w:r>
-        <w:rPr>
-          <w:sz w:val="28"/>
-          <w:szCs w:val="32"/>
-          <w:lang w:val="en-US"/>
-        </w:rPr>
-        <w:t>ProgressRepo</w:t>
-      </w:r>
-      <w:proofErr w:type="spellEnd"/>
-    </w:p>
-    <w:p>
-      <w:pPr>
-        <w:rPr>
-          <w:sz w:val="28"/>
-          <w:szCs w:val="32"/>
-        </w:rPr>
-      </w:pPr>
-      <w:r>
-        <w:rPr>
-          <w:sz w:val="28"/>
-          <w:szCs w:val="32"/>
-          <w:lang w:val="en-US"/>
-        </w:rPr>
-        <w:t>D</w:t>
-      </w:r>
-      <w:r>
-        <w:rPr>
-          <w:sz w:val="28"/>
-          <w:szCs w:val="32"/>
-        </w:rPr>
-        <w:t xml:space="preserve"> </w:t>
-      </w:r>
-      <w:r>
-        <w:rPr>
-          <w:sz w:val="28"/>
-          <w:szCs w:val="32"/>
-        </w:rPr>
-        <w:t>–</w:t>
-      </w:r>
-      <w:r>
-        <w:rPr>
-          <w:sz w:val="28"/>
-          <w:szCs w:val="32"/>
-        </w:rPr>
-        <w:t xml:space="preserve"> </w:t>
-      </w:r>
-      <w:r>
-        <w:rPr>
-          <w:sz w:val="28"/>
-          <w:szCs w:val="32"/>
-        </w:rPr>
         <w:t>Выдать задание кейс (зависит от) Интерфейс заданий</w:t>
+      </w:r>
+    </w:p>
+    <w:p>
+      <w:pPr>
+        <w:rPr>
+          <w:sz w:val="28"/>
+          <w:szCs w:val="32"/>
+          <w:lang w:val="en-US"/>
+        </w:rPr>
+      </w:pPr>
+      <w:r>
+        <w:rPr>
+          <w:sz w:val="28"/>
+          <w:szCs w:val="32"/>
+        </w:rPr>
+        <w:lastRenderedPageBreak/>
+        <w:t xml:space="preserve">Диаграмма классов </w:t>
+      </w:r>
+      <w:r>
+        <w:rPr>
+          <w:sz w:val="28"/>
+          <w:szCs w:val="32"/>
+          <w:lang w:val="en-US"/>
+        </w:rPr>
+        <w:t>Domain</w:t>
+      </w:r>
+    </w:p>
+    <w:p>
+      <w:pPr>
+        <w:rPr>
+          <w:sz w:val="28"/>
+          <w:szCs w:val="32"/>
+        </w:rPr>
+      </w:pPr>
+      <w:r>
+        <w:rPr>
+          <w:noProof/>
+          <w:sz w:val="28"/>
+          <w:szCs w:val="32"/>
+        </w:rPr>
+        <w:drawing>
+          <wp:inline distT="0" distB="0" distL="0" distR="0" wp14:anchorId="1105DF0C" wp14:editId="1FBA070F">
+            <wp:extent cx="5553075" cy="3217047"/>
+            <wp:effectExtent l="0" t="0" r="0" b="0"/>
+            <wp:docPr id="2" name="Рисунок 2"/>
+            <wp:cNvGraphicFramePr>
+              <a:graphicFrameLocks xmlns:a="http://schemas.openxmlformats.org/drawingml/2006/main" noChangeAspect="1"/>
+            </wp:cNvGraphicFramePr>
+            <a:graphic xmlns:a="http://schemas.openxmlformats.org/drawingml/2006/main">
+              <a:graphicData uri="http://schemas.openxmlformats.org/drawingml/2006/picture">
+                <pic:pic xmlns:pic="http://schemas.openxmlformats.org/drawingml/2006/picture">
+                  <pic:nvPicPr>
+                    <pic:cNvPr id="0" name="Picture 2"/>
+                    <pic:cNvPicPr>
+                      <a:picLocks noChangeAspect="1" noChangeArrowheads="1"/>
+                    </pic:cNvPicPr>
+                  </pic:nvPicPr>
+                  <pic:blipFill>
+                    <a:blip r:embed="rId5" cstate="print">
+                      <a:extLst>
+                        <a:ext uri="{28A0092B-C50C-407E-A947-70E740481C1C}">
+                          <a14:useLocalDpi xmlns:a14="http://schemas.microsoft.com/office/drawing/2010/main" val="0"/>
+                        </a:ext>
+                      </a:extLst>
+                    </a:blip>
+                    <a:srcRect/>
+                    <a:stretch>
+                      <a:fillRect/>
+                    </a:stretch>
+                  </pic:blipFill>
+                  <pic:spPr bwMode="auto">
+                    <a:xfrm>
+                      <a:off x="0" y="0"/>
+                      <a:ext cx="5581922" cy="3233759"/>
+                    </a:xfrm>
+                    <a:prstGeom prst="rect">
+                      <a:avLst/>
+                    </a:prstGeom>
+                    <a:noFill/>
+                  </pic:spPr>
+                </pic:pic>
+              </a:graphicData>
+            </a:graphic>
+          </wp:inline>
+        </w:drawing>
       </w:r>
     </w:p>
     <w:sectPr>

</xml_diff>